<commit_message>
v23 verification: carbon closes to machine precision; Fig 3 on v23; irr061 year-1 v23 budgets
Co-Authored-By: Claude Opus 5.5 <noreply@anthropic.com>
Claude-Session: https://claude.ai/code/session_011eE6rAt4DAy7w44Js7Frnz
</commit_message>
<xml_diff>
--- a/manuscript_gmd/Riceland_SCEPTER_GMD_figures_v22_2026-10-31.docx
+++ b/manuscript_gmd/Riceland_SCEPTER_GMD_figures_v22_2026-10-31.docx
@@ -15,7 +15,7 @@
         <w:pStyle w:val="BodyText"/>
       </w:pPr>
       <w:r>
-        <w:t>All panels use executable scepter_paddy_v22 (commit 162913a), k_cal.in (methanogenesis vmax 1860 yr⁻¹) and the Si feedback K_Si = 2 mmol L⁻¹, w = 0.2, with no site recalibration, except where a panel says otherwise. Fig. 6a varies w and other inputs as stated.</w:t>
+        <w:t>Fig. 3 uses executable scepter_paddy_v23 (commit 267a856: v22 plus the carbon-closure fix); all other panels use scepter_paddy_v22 (commit 162913a), k_cal.in (methanogenesis vmax 1860 yr⁻¹) and the Si feedback K_Si = 2 mmol L⁻¹, w = 0.2, with no site recalibration, except where a panel says otherwise. Fig. 6a varies w and other inputs as stated.</w:t>
       </w:r>
     </w:p>
     <w:p>
@@ -128,7 +128,7 @@
               <a:graphicData uri="http://schemas.openxmlformats.org/drawingml/2006/picture">
                 <pic:pic>
                   <pic:nvPicPr>
-                    <pic:cNvPr id="0" name="fig3_verification_v22.png"/>
+                    <pic:cNvPr id="0" name="fig3_verification_v23.png"/>
                     <pic:cNvPicPr/>
                   </pic:nvPicPr>
                   <pic:blipFill>
@@ -156,7 +156,7 @@
         <w:pStyle w:val="ImageCaption"/>
       </w:pPr>
       <w:r>
-        <w:t>Fig. 3. Numerical verification (v22). (a) PHREEQC example 11 cation-exchange benchmark, outlet concentrations (lines: SCEPTER; circles: PHREEQC). (b) pH of 175 model porewaters (archetype irr061: flooded, AWD drained and reflooded, and fallow, at 0 and 20 t ha⁻¹) recomputed by charge balance in PHREEQC (phreeqc.dat). (c) Model log Ω against PHREEQC SI with activity coefficients removed (the model runs as an ideal solution); siderite is shifted by the model’s +1 log-unit apparent solubility. (d) Worst relative imbalance in element budgets over eight season and fallow runs: internal reaction terms (blue) and storage against profile inventories (orange). Fe, N, Ca and Mg close to within 3 × 10⁻⁷ of the gross flux. Carbon does not close exactly: a bookkeeping residual of 0.35% of the gross C flux remains in the internal reaction terms, attributed to oxalate and acetate from aerobic OM breakdown that are not tracked as carbon.</w:t>
+        <w:t>Fig. 3. Numerical verification (v23). (a) PHREEQC example 11 cation-exchange benchmark, outlet concentrations (lines: SCEPTER; circles: PHREEQC). (b) pH of 175 model porewaters (archetype irr061: flooded, AWD drained and reflooded, and fallow, at 0 and 20 t ha⁻¹) recomputed by charge balance in PHREEQC (phreeqc.dat). (c) Model log Ω against PHREEQC SI with activity coefficients removed (the model runs as an ideal solution); siderite is shifted by the model’s +1 log-unit apparent solubility. (d) Worst relative imbalance in element budgets over eight season and fallow runs: internal reaction terms (blue) and storage against profile inventories (orange). C, Fe, N, Ca and Mg close to within 5 × 10⁻¹¹ (reaction terms) and 2 × 10⁻⁷ (storage) of the gross flux. In v22, carbon had a residual of 0.35% of the gross C flux because the upstream SCEPTER organic-matter decay sent 4% of its carbon to oxalate and acetate, which are not tracked in the paddy configuration; v23 returns that carbon to CO₂, closing the carbon budget to machine precision. The change alters year-1 CH₄, N₂O and exported alkalinity by less than 0.3% at irr061.</w:t>
       </w:r>
     </w:p>
     <w:p>

</xml_diff>

<commit_message>
Figures: larger print-size fonts on all figures; schematics redrawn on narrower canvas
Co-Authored-By: Claude Opus 5.5 <noreply@anthropic.com>
Claude-Session: https://claude.ai/code/session_011eE6rAt4DAy7w44Js7Frnz
</commit_message>
<xml_diff>
--- a/manuscript_gmd/Riceland_SCEPTER_GMD_figures_v22_2026-10-31.docx
+++ b/manuscript_gmd/Riceland_SCEPTER_GMD_figures_v22_2026-10-31.docx
@@ -25,7 +25,7 @@
       <w:r>
         <w:drawing>
           <wp:inline xmlns:a="http://schemas.openxmlformats.org/drawingml/2006/main" xmlns:pic="http://schemas.openxmlformats.org/drawingml/2006/picture">
-            <wp:extent cx="5868000" cy="4272638"/>
+            <wp:extent cx="5705660" cy="7560000"/>
             <wp:docPr id="1" name="Picture 1"/>
             <wp:cNvGraphicFramePr>
               <a:graphicFrameLocks noChangeAspect="1"/>
@@ -46,7 +46,7 @@
                   <pic:spPr>
                     <a:xfrm>
                       <a:off x="0" y="0"/>
-                      <a:ext cx="5868000" cy="4272638"/>
+                      <a:ext cx="5705660" cy="7560000"/>
                     </a:xfrm>
                     <a:prstGeom prst="rect"/>
                   </pic:spPr>
@@ -72,7 +72,7 @@
       <w:r>
         <w:drawing>
           <wp:inline xmlns:a="http://schemas.openxmlformats.org/drawingml/2006/main" xmlns:pic="http://schemas.openxmlformats.org/drawingml/2006/picture">
-            <wp:extent cx="5868000" cy="3667500"/>
+            <wp:extent cx="5384615" cy="7559999"/>
             <wp:docPr id="2" name="Picture 2"/>
             <wp:cNvGraphicFramePr>
               <a:graphicFrameLocks noChangeAspect="1"/>
@@ -93,7 +93,7 @@
                   <pic:spPr>
                     <a:xfrm>
                       <a:off x="0" y="0"/>
-                      <a:ext cx="5868000" cy="3667500"/>
+                      <a:ext cx="5384615" cy="7559999"/>
                     </a:xfrm>
                     <a:prstGeom prst="rect"/>
                   </pic:spPr>
@@ -166,7 +166,7 @@
       <w:r>
         <w:drawing>
           <wp:inline xmlns:a="http://schemas.openxmlformats.org/drawingml/2006/main" xmlns:pic="http://schemas.openxmlformats.org/drawingml/2006/picture">
-            <wp:extent cx="5868000" cy="2527754"/>
+            <wp:extent cx="5328634" cy="7560000"/>
             <wp:docPr id="4" name="Picture 4"/>
             <wp:cNvGraphicFramePr>
               <a:graphicFrameLocks noChangeAspect="1"/>
@@ -187,7 +187,7 @@
                   <pic:spPr>
                     <a:xfrm>
                       <a:off x="0" y="0"/>
-                      <a:ext cx="5868000" cy="2527754"/>
+                      <a:ext cx="5328634" cy="7560000"/>
                     </a:xfrm>
                     <a:prstGeom prst="rect"/>
                   </pic:spPr>
@@ -213,7 +213,7 @@
       <w:r>
         <w:drawing>
           <wp:inline xmlns:a="http://schemas.openxmlformats.org/drawingml/2006/main" xmlns:pic="http://schemas.openxmlformats.org/drawingml/2006/picture">
-            <wp:extent cx="5868000" cy="3331434"/>
+            <wp:extent cx="5868000" cy="7512255"/>
             <wp:docPr id="5" name="Picture 5"/>
             <wp:cNvGraphicFramePr>
               <a:graphicFrameLocks noChangeAspect="1"/>
@@ -234,7 +234,7 @@
                   <pic:spPr>
                     <a:xfrm>
                       <a:off x="0" y="0"/>
-                      <a:ext cx="5868000" cy="3331434"/>
+                      <a:ext cx="5868000" cy="7512255"/>
                     </a:xfrm>
                     <a:prstGeom prst="rect"/>
                   </pic:spPr>
@@ -260,7 +260,7 @@
       <w:r>
         <w:drawing>
           <wp:inline xmlns:a="http://schemas.openxmlformats.org/drawingml/2006/main" xmlns:pic="http://schemas.openxmlformats.org/drawingml/2006/picture">
-            <wp:extent cx="5868000" cy="1799520"/>
+            <wp:extent cx="5040000" cy="7560000"/>
             <wp:docPr id="6" name="Picture 6"/>
             <wp:cNvGraphicFramePr>
               <a:graphicFrameLocks noChangeAspect="1"/>
@@ -281,7 +281,7 @@
                   <pic:spPr>
                     <a:xfrm>
                       <a:off x="0" y="0"/>
-                      <a:ext cx="5868000" cy="1799520"/>
+                      <a:ext cx="5040000" cy="7560000"/>
                     </a:xfrm>
                     <a:prstGeom prst="rect"/>
                   </pic:spPr>
@@ -299,7 +299,7 @@
       <w:r>
         <w:drawing>
           <wp:inline xmlns:a="http://schemas.openxmlformats.org/drawingml/2006/main" xmlns:pic="http://schemas.openxmlformats.org/drawingml/2006/picture">
-            <wp:extent cx="5868000" cy="1721280"/>
+            <wp:extent cx="4811136" cy="7559999"/>
             <wp:docPr id="7" name="Picture 7"/>
             <wp:cNvGraphicFramePr>
               <a:graphicFrameLocks noChangeAspect="1"/>
@@ -320,7 +320,7 @@
                   <pic:spPr>
                     <a:xfrm>
                       <a:off x="0" y="0"/>
-                      <a:ext cx="5868000" cy="1721280"/>
+                      <a:ext cx="4811136" cy="7559999"/>
                     </a:xfrm>
                     <a:prstGeom prst="rect"/>
                   </pic:spPr>
@@ -346,7 +346,7 @@
       <w:r>
         <w:drawing>
           <wp:inline xmlns:a="http://schemas.openxmlformats.org/drawingml/2006/main" xmlns:pic="http://schemas.openxmlformats.org/drawingml/2006/picture">
-            <wp:extent cx="5868000" cy="1799520"/>
+            <wp:extent cx="5040000" cy="7560000"/>
             <wp:docPr id="8" name="Picture 8"/>
             <wp:cNvGraphicFramePr>
               <a:graphicFrameLocks noChangeAspect="1"/>
@@ -367,7 +367,7 @@
                   <pic:spPr>
                     <a:xfrm>
                       <a:off x="0" y="0"/>
-                      <a:ext cx="5868000" cy="1799520"/>
+                      <a:ext cx="5040000" cy="7560000"/>
                     </a:xfrm>
                     <a:prstGeom prst="rect"/>
                   </pic:spPr>
@@ -393,7 +393,7 @@
       <w:r>
         <w:drawing>
           <wp:inline xmlns:a="http://schemas.openxmlformats.org/drawingml/2006/main" xmlns:pic="http://schemas.openxmlformats.org/drawingml/2006/picture">
-            <wp:extent cx="5868000" cy="2211785"/>
+            <wp:extent cx="5554994" cy="7560000"/>
             <wp:docPr id="9" name="Picture 9"/>
             <wp:cNvGraphicFramePr>
               <a:graphicFrameLocks noChangeAspect="1"/>
@@ -414,7 +414,7 @@
                   <pic:spPr>
                     <a:xfrm>
                       <a:off x="0" y="0"/>
-                      <a:ext cx="5868000" cy="2211785"/>
+                      <a:ext cx="5554994" cy="7560000"/>
                     </a:xfrm>
                     <a:prstGeom prst="rect"/>
                   </pic:spPr>

</xml_diff>

<commit_message>
Figures: larger text on Figs 1-3 (detail moved to captions), Fig 7 labels off the data
Co-Authored-By: Claude Opus 5.5 <noreply@anthropic.com>
Claude-Session: https://claude.ai/code/session_011eE6rAt4DAy7w44Js7Frnz
</commit_message>
<xml_diff>
--- a/manuscript_gmd/Riceland_SCEPTER_GMD_figures_v22_2026-10-31.docx
+++ b/manuscript_gmd/Riceland_SCEPTER_GMD_figures_v22_2026-10-31.docx
@@ -25,7 +25,7 @@
       <w:r>
         <w:drawing>
           <wp:inline xmlns:a="http://schemas.openxmlformats.org/drawingml/2006/main" xmlns:pic="http://schemas.openxmlformats.org/drawingml/2006/picture">
-            <wp:extent cx="5705660" cy="7560000"/>
+            <wp:extent cx="5658682" cy="7559999"/>
             <wp:docPr id="1" name="Picture 1"/>
             <wp:cNvGraphicFramePr>
               <a:graphicFrameLocks noChangeAspect="1"/>
@@ -46,7 +46,7 @@
                   <pic:spPr>
                     <a:xfrm>
                       <a:off x="0" y="0"/>
-                      <a:ext cx="5705660" cy="7560000"/>
+                      <a:ext cx="5658682" cy="7559999"/>
                     </a:xfrm>
                     <a:prstGeom prst="rect"/>
                   </pic:spPr>
@@ -62,7 +62,7 @@
         <w:pStyle w:val="ImageCaption"/>
       </w:pPr>
       <w:r>
-        <w:t>Fig. 1. Model structure and processes. (a) The 0.5 m paddy column (25 cells): puddled plough layer (0–0.2 m, mixed before each season), plough pan (0.20–0.24 m; aqueous and gas diffusivities × 0.1) and a partly saturated subsoil open to air at its base. CH₄ leaves by plant transport, ebullition and diffusion. Basalt, mixed into 0–0.15 m, releases cations, Fe²⁺, Si and alkalinity, and the model tracks three fates separately: cations retained on exchange sites and in porewater (CDR potential only), soil carbonate, and potentially durable alkalinity exported through the base (PDA = ALK − 2Fe(II) − 2NH₄⁺). The Si-dependent root-O₂ term (dashed box) is empirical and switchable (v22: K_Si = 2 mmol L⁻¹, w = 0.2; w = 0 switches it off). (b) Microbial electron-acceptor sequence and the Fe²⁺ cycle (green rust pH-stat, siderite, FeS, exchange, re-oxidation by O₂ on drainage). (c) Seasonal saturation and drainage: a 113-day season (continuous flooding or AWD, both ending with a 14-day pre-harvest drain) and a 252-day drained fallow, run as a chain of restarts.</w:t>
+        <w:t>Fig. 1. Model structure and processes. (a) The 0.5 m paddy column (25 cells): puddled plough layer (0–0.2 m, mixed before each season), plough pan (0.20–0.24 m; aqueous and gas diffusivities × 0.1) and a partly saturated subsoil open to air at its base. CH₄ leaves by plant transport (30–90% oxidised in the rhizosphere; Eqs. 8–9), ebullition (above 0.4 atm CH₄) and diffusion through the floodwater (Eq. 10). Percolation is 0.5 m yr⁻¹ (1.4 mm d⁻¹); Fe²⁺ leached through the pan is re-oxidised in the subsoil. Basalt, mixed into 0–0.15 m, releases cations, Fe²⁺, Si and alkalinity, and the model tracks three fates separately: cations retained on exchange sites and in porewater (CDR potential only), soil carbonate, and potentially durable alkalinity exported through the base (PDA = ALK − 2Fe(II) − 2NH₄⁺). The Si-dependent root-O₂ term (dashed box) is empirical and switchable (v22: K_Si = 2 mmol L⁻¹, w = 0.2; w = 0 switches it off). (b) Microbial electron-acceptor sequence (Monod kinetics in OM and acceptor, Eq. 3) and the Fe²⁺ cycle (green rust pH-stat, Eq. 5; siderite, FeS, exchange; re-oxidation by O₂ on drainage and in the fallow, Eq. 6). Urea hydrolyses to NH₄⁺, which is held on exchange sites, taken up by rice or nitrified to NO₃⁻; the N₂O yield of denitrification depends on pH (Eq. 7). NO₃⁻ inhibits pathways ③–⑤; goethite is reduced ~30× more slowly than ferrihydrite; CH₄ production is inhibited by reducible Fe(III) and SO₄²⁻ (Eq. 4). Microbial rates scale with Q10 = 2 (methanogenesis 3) from 25 °C (Eq. 2). pH is solved from charge balance at each Newton step, so reactions carry no explicit H⁺. (c) Seasonal saturation and drainage: a 113-day season (continuous flooding or AWD, both ending with a 14-day pre-harvest drain) and a 252-day drained fallow (water table 0.5 m), run as a chain of restarts. Tillage and basalt are applied on day 0; OM, Fe(III) and urea (120 kg N ha⁻¹) are added at a constant rate through the season.</w:t>
       </w:r>
     </w:p>
     <w:p>
@@ -72,7 +72,7 @@
       <w:r>
         <w:drawing>
           <wp:inline xmlns:a="http://schemas.openxmlformats.org/drawingml/2006/main" xmlns:pic="http://schemas.openxmlformats.org/drawingml/2006/picture">
-            <wp:extent cx="5384615" cy="7559999"/>
+            <wp:extent cx="5762195" cy="7560000"/>
             <wp:docPr id="2" name="Picture 2"/>
             <wp:cNvGraphicFramePr>
               <a:graphicFrameLocks noChangeAspect="1"/>
@@ -93,7 +93,7 @@
                   <pic:spPr>
                     <a:xfrm>
                       <a:off x="0" y="0"/>
-                      <a:ext cx="5384615" cy="7559999"/>
+                      <a:ext cx="5762195" cy="7560000"/>
                     </a:xfrm>
                     <a:prstGeom prst="rect"/>
                   </pic:spPr>
@@ -109,7 +109,7 @@
         <w:pStyle w:val="ImageCaption"/>
       </w:pPr>
       <w:r>
-        <w:t>Fig. 2. Implementation and simulation protocol. (a) Inputs, the Python driver, the original SCEPTER v1.0 core (grey) and the added paddy modules (green), and outputs. Each paddy term reads its own input file and is off when the file is absent. Frozen v22 provenance: executable, commit, calibrated constants and Si-feedback setting. (b) Prescribed hydrology and the run protocol: 3-yr drained spin-up, 7-yr settle without rock, then year-matched control and treatment chains from the same settled state (tillage, season, fallow), with GHG and CDR post-processing. Model switches are listed with their driver flags.</w:t>
+        <w:t>Fig. 2. Implementation and simulation protocol. (a) Inputs, the Python driver, the original SCEPTER v1.0 core (grey) and the added paddy modules (green), and outputs. Each paddy term reads its own input file and is off when the file is absent. Frozen v22 provenance: executable, commit, calibrated constants and Si-feedback setting. (b) Prescribed hydrology and the run protocol: 3-yr drained spin-up, 7-yr settle without rock, then year-matched control and treatment chains from the same settled state (tillage, season, fallow), with GHG and CDR post-processing. The input files written by the driver and the model switches (driver flag → input file) are listed in Appendix A. Fig. 3 was rerun on v23 (v22 plus the carbon-closure fix).</w:t>
       </w:r>
     </w:p>
     <w:p>
@@ -119,7 +119,7 @@
       <w:r>
         <w:drawing>
           <wp:inline xmlns:a="http://schemas.openxmlformats.org/drawingml/2006/main" xmlns:pic="http://schemas.openxmlformats.org/drawingml/2006/picture">
-            <wp:extent cx="5868000" cy="4694400"/>
+            <wp:extent cx="5868000" cy="6549544"/>
             <wp:docPr id="3" name="Picture 3"/>
             <wp:cNvGraphicFramePr>
               <a:graphicFrameLocks noChangeAspect="1"/>
@@ -140,7 +140,7 @@
                   <pic:spPr>
                     <a:xfrm>
                       <a:off x="0" y="0"/>
-                      <a:ext cx="5868000" cy="4694400"/>
+                      <a:ext cx="5868000" cy="6549544"/>
                     </a:xfrm>
                     <a:prstGeom prst="rect"/>
                   </pic:spPr>

</xml_diff>